<commit_message>
acomodo, bitacora y la segunda semana
</commit_message>
<xml_diff>
--- a/evidencias/evidenciasSemana1.docx
+++ b/evidencias/evidenciasSemana1.docx
@@ -109,8 +109,54 @@
           <w:sz w:val="24"/>
           <w:szCs w:val="24"/>
         </w:rPr>
-        <w:t>rototipo del formulario inicial  y se detallo el diagrama de grant para la organización del trabajp</w:t>
-      </w:r>
+        <w:t xml:space="preserve">rototipo del formulario inicial  y se </w:t>
+      </w:r>
+      <w:proofErr w:type="spellStart"/>
+      <w:r>
+        <w:rPr>
+          <w:rFonts w:ascii="Arial" w:hAnsi="Arial" w:cs="Arial"/>
+          <w:sz w:val="24"/>
+          <w:szCs w:val="24"/>
+        </w:rPr>
+        <w:t>detallo</w:t>
+      </w:r>
+      <w:proofErr w:type="spellEnd"/>
+      <w:r>
+        <w:rPr>
+          <w:rFonts w:ascii="Arial" w:hAnsi="Arial" w:cs="Arial"/>
+          <w:sz w:val="24"/>
+          <w:szCs w:val="24"/>
+        </w:rPr>
+        <w:t xml:space="preserve"> el diagrama de </w:t>
+      </w:r>
+      <w:proofErr w:type="spellStart"/>
+      <w:r>
+        <w:rPr>
+          <w:rFonts w:ascii="Arial" w:hAnsi="Arial" w:cs="Arial"/>
+          <w:sz w:val="24"/>
+          <w:szCs w:val="24"/>
+        </w:rPr>
+        <w:t>grant</w:t>
+      </w:r>
+      <w:proofErr w:type="spellEnd"/>
+      <w:r>
+        <w:rPr>
+          <w:rFonts w:ascii="Arial" w:hAnsi="Arial" w:cs="Arial"/>
+          <w:sz w:val="24"/>
+          <w:szCs w:val="24"/>
+        </w:rPr>
+        <w:t xml:space="preserve"> para la organización del </w:t>
+      </w:r>
+      <w:proofErr w:type="spellStart"/>
+      <w:r>
+        <w:rPr>
+          <w:rFonts w:ascii="Arial" w:hAnsi="Arial" w:cs="Arial"/>
+          <w:sz w:val="24"/>
+          <w:szCs w:val="24"/>
+        </w:rPr>
+        <w:t>trabajp</w:t>
+      </w:r>
+      <w:proofErr w:type="spellEnd"/>
     </w:p>
     <w:p>
       <w:pPr>
@@ -257,7 +303,25 @@
           <w:sz w:val="24"/>
           <w:szCs w:val="24"/>
         </w:rPr>
-        <w:t>Se comenzó a trabajar en el archivo js para validación de campos y despliegue de los inputs</w:t>
+        <w:t xml:space="preserve">Se comenzó a trabajar en el archivo </w:t>
+      </w:r>
+      <w:proofErr w:type="spellStart"/>
+      <w:r>
+        <w:rPr>
+          <w:rFonts w:ascii="Arial" w:hAnsi="Arial" w:cs="Arial"/>
+          <w:sz w:val="24"/>
+          <w:szCs w:val="24"/>
+        </w:rPr>
+        <w:t>js</w:t>
+      </w:r>
+      <w:proofErr w:type="spellEnd"/>
+      <w:r>
+        <w:rPr>
+          <w:rFonts w:ascii="Arial" w:hAnsi="Arial" w:cs="Arial"/>
+          <w:sz w:val="24"/>
+          <w:szCs w:val="24"/>
+        </w:rPr>
+        <w:t xml:space="preserve"> para validación de campos y despliegue de los inputs</w:t>
       </w:r>
     </w:p>
     <w:p>
@@ -489,7 +553,61 @@
           <w:sz w:val="24"/>
           <w:szCs w:val="24"/>
         </w:rPr>
-        <w:t>Se empezó a modificar el css tomando como referencia uno de una practica pasada con algunos ajustes para que luzca lo mas parecido al de referencia</w:t>
+        <w:t xml:space="preserve">Se empezó a modificar el </w:t>
+      </w:r>
+      <w:proofErr w:type="spellStart"/>
+      <w:r>
+        <w:rPr>
+          <w:rFonts w:ascii="Arial" w:hAnsi="Arial" w:cs="Arial"/>
+          <w:sz w:val="24"/>
+          <w:szCs w:val="24"/>
+        </w:rPr>
+        <w:t>css</w:t>
+      </w:r>
+      <w:proofErr w:type="spellEnd"/>
+      <w:r>
+        <w:rPr>
+          <w:rFonts w:ascii="Arial" w:hAnsi="Arial" w:cs="Arial"/>
+          <w:sz w:val="24"/>
+          <w:szCs w:val="24"/>
+        </w:rPr>
+        <w:t xml:space="preserve"> tomando como referencia uno de una </w:t>
+      </w:r>
+      <w:proofErr w:type="spellStart"/>
+      <w:r>
+        <w:rPr>
+          <w:rFonts w:ascii="Arial" w:hAnsi="Arial" w:cs="Arial"/>
+          <w:sz w:val="24"/>
+          <w:szCs w:val="24"/>
+        </w:rPr>
+        <w:t>practica</w:t>
+      </w:r>
+      <w:proofErr w:type="spellEnd"/>
+      <w:r>
+        <w:rPr>
+          <w:rFonts w:ascii="Arial" w:hAnsi="Arial" w:cs="Arial"/>
+          <w:sz w:val="24"/>
+          <w:szCs w:val="24"/>
+        </w:rPr>
+        <w:t xml:space="preserve"> pasada con algunos ajustes para que luzca lo </w:t>
+      </w:r>
+      <w:proofErr w:type="spellStart"/>
+      <w:r>
+        <w:rPr>
+          <w:rFonts w:ascii="Arial" w:hAnsi="Arial" w:cs="Arial"/>
+          <w:sz w:val="24"/>
+          <w:szCs w:val="24"/>
+        </w:rPr>
+        <w:t>mas</w:t>
+      </w:r>
+      <w:proofErr w:type="spellEnd"/>
+      <w:r>
+        <w:rPr>
+          <w:rFonts w:ascii="Arial" w:hAnsi="Arial" w:cs="Arial"/>
+          <w:sz w:val="24"/>
+          <w:szCs w:val="24"/>
+        </w:rPr>
+        <w:t xml:space="preserve"> parecido al de referencia</w:t>
       </w:r>
     </w:p>
     <w:p>
@@ -620,20 +738,57 @@
           <w:sz w:val="24"/>
           <w:szCs w:val="24"/>
         </w:rPr>
-        <w:t>Por otro lado, se implemento el guardado a través del uso del localStorage con varios intentos que hasta la fecha se sigue trabajando y buscando posibles errores</w:t>
-      </w:r>
-    </w:p>
-    <w:p>
-      <w:pPr>
-        <w:rPr>
-          <w:rFonts w:ascii="Arial" w:hAnsi="Arial" w:cs="Arial"/>
-          <w:sz w:val="24"/>
-          <w:szCs w:val="24"/>
-        </w:rPr>
-      </w:pPr>
-      <w:r>
-        <w:rPr>
-          <w:rFonts w:ascii="Arial" w:hAnsi="Arial" w:cs="Arial"/>
+        <w:t xml:space="preserve">Por otro lado, se </w:t>
+      </w:r>
+      <w:proofErr w:type="spellStart"/>
+      <w:r>
+        <w:rPr>
+          <w:rFonts w:ascii="Arial" w:hAnsi="Arial" w:cs="Arial"/>
+          <w:sz w:val="24"/>
+          <w:szCs w:val="24"/>
+        </w:rPr>
+        <w:t>implemento</w:t>
+      </w:r>
+      <w:proofErr w:type="spellEnd"/>
+      <w:r>
+        <w:rPr>
+          <w:rFonts w:ascii="Arial" w:hAnsi="Arial" w:cs="Arial"/>
+          <w:sz w:val="24"/>
+          <w:szCs w:val="24"/>
+        </w:rPr>
+        <w:t xml:space="preserve"> el guardado a través del uso del </w:t>
+      </w:r>
+      <w:proofErr w:type="spellStart"/>
+      <w:r>
+        <w:rPr>
+          <w:rFonts w:ascii="Arial" w:hAnsi="Arial" w:cs="Arial"/>
+          <w:sz w:val="24"/>
+          <w:szCs w:val="24"/>
+        </w:rPr>
+        <w:t>localStorage</w:t>
+      </w:r>
+      <w:proofErr w:type="spellEnd"/>
+      <w:r>
+        <w:rPr>
+          <w:rFonts w:ascii="Arial" w:hAnsi="Arial" w:cs="Arial"/>
+          <w:sz w:val="24"/>
+          <w:szCs w:val="24"/>
+        </w:rPr>
+        <w:t xml:space="preserve"> con varios intentos que hasta la fecha se sigue trabajando y buscando posibles errores</w:t>
+      </w:r>
+    </w:p>
+    <w:p>
+      <w:pPr>
+        <w:rPr>
+          <w:rFonts w:ascii="Arial" w:hAnsi="Arial" w:cs="Arial"/>
+          <w:sz w:val="24"/>
+          <w:szCs w:val="24"/>
+        </w:rPr>
+      </w:pPr>
+      <w:r>
+        <w:rPr>
+          <w:rFonts w:ascii="Arial" w:hAnsi="Arial" w:cs="Arial"/>
+          <w:noProof/>
           <w:sz w:val="24"/>
           <w:szCs w:val="24"/>
         </w:rPr>
@@ -715,29 +870,76 @@
           <w:sz w:val="24"/>
           <w:szCs w:val="24"/>
         </w:rPr>
-        <w:t>Se comenzó a trabajar en la funcionalidad del crud para las actividades que esten registradas en el localStorage</w:t>
-      </w:r>
-    </w:p>
-    <w:p>
-      <w:pPr>
-        <w:rPr>
-          <w:rFonts w:ascii="Arial" w:hAnsi="Arial" w:cs="Arial"/>
-          <w:sz w:val="24"/>
-          <w:szCs w:val="24"/>
-        </w:rPr>
-      </w:pPr>
-    </w:p>
-    <w:p>
-      <w:pPr>
-        <w:rPr>
-          <w:rFonts w:ascii="Arial" w:hAnsi="Arial" w:cs="Arial"/>
-          <w:sz w:val="24"/>
-          <w:szCs w:val="24"/>
-        </w:rPr>
-      </w:pPr>
-      <w:r>
-        <w:rPr>
-          <w:rFonts w:ascii="Arial" w:hAnsi="Arial" w:cs="Arial"/>
+        <w:t xml:space="preserve">Se comenzó a trabajar en la funcionalidad del </w:t>
+      </w:r>
+      <w:proofErr w:type="spellStart"/>
+      <w:r>
+        <w:rPr>
+          <w:rFonts w:ascii="Arial" w:hAnsi="Arial" w:cs="Arial"/>
+          <w:sz w:val="24"/>
+          <w:szCs w:val="24"/>
+        </w:rPr>
+        <w:t>crud</w:t>
+      </w:r>
+      <w:proofErr w:type="spellEnd"/>
+      <w:r>
+        <w:rPr>
+          <w:rFonts w:ascii="Arial" w:hAnsi="Arial" w:cs="Arial"/>
+          <w:sz w:val="24"/>
+          <w:szCs w:val="24"/>
+        </w:rPr>
+        <w:t xml:space="preserve"> para las actividades que </w:t>
+      </w:r>
+      <w:proofErr w:type="spellStart"/>
+      <w:r>
+        <w:rPr>
+          <w:rFonts w:ascii="Arial" w:hAnsi="Arial" w:cs="Arial"/>
+          <w:sz w:val="24"/>
+          <w:szCs w:val="24"/>
+        </w:rPr>
+        <w:t>esten</w:t>
+      </w:r>
+      <w:proofErr w:type="spellEnd"/>
+      <w:r>
+        <w:rPr>
+          <w:rFonts w:ascii="Arial" w:hAnsi="Arial" w:cs="Arial"/>
+          <w:sz w:val="24"/>
+          <w:szCs w:val="24"/>
+        </w:rPr>
+        <w:t xml:space="preserve"> registradas en el </w:t>
+      </w:r>
+      <w:proofErr w:type="spellStart"/>
+      <w:r>
+        <w:rPr>
+          <w:rFonts w:ascii="Arial" w:hAnsi="Arial" w:cs="Arial"/>
+          <w:sz w:val="24"/>
+          <w:szCs w:val="24"/>
+        </w:rPr>
+        <w:t>localStorage</w:t>
+      </w:r>
+      <w:proofErr w:type="spellEnd"/>
+    </w:p>
+    <w:p>
+      <w:pPr>
+        <w:rPr>
+          <w:rFonts w:ascii="Arial" w:hAnsi="Arial" w:cs="Arial"/>
+          <w:sz w:val="24"/>
+          <w:szCs w:val="24"/>
+        </w:rPr>
+      </w:pPr>
+    </w:p>
+    <w:p>
+      <w:pPr>
+        <w:rPr>
+          <w:rFonts w:ascii="Arial" w:hAnsi="Arial" w:cs="Arial"/>
+          <w:sz w:val="24"/>
+          <w:szCs w:val="24"/>
+        </w:rPr>
+      </w:pPr>
+      <w:r>
+        <w:rPr>
+          <w:rFonts w:ascii="Arial" w:hAnsi="Arial" w:cs="Arial"/>
+          <w:noProof/>
           <w:sz w:val="24"/>
           <w:szCs w:val="24"/>
         </w:rPr>
@@ -776,6 +978,74 @@
             </a:graphic>
           </wp:inline>
         </w:drawing>
+      </w:r>
+    </w:p>
+    <w:p>
+      <w:pPr>
+        <w:rPr>
+          <w:rFonts w:ascii="Arial" w:hAnsi="Arial" w:cs="Arial"/>
+          <w:sz w:val="24"/>
+          <w:szCs w:val="24"/>
+        </w:rPr>
+      </w:pPr>
+      <w:r>
+        <w:rPr>
+          <w:rFonts w:ascii="Arial" w:hAnsi="Arial" w:cs="Arial"/>
+          <w:sz w:val="24"/>
+          <w:szCs w:val="24"/>
+        </w:rPr>
+        <w:lastRenderedPageBreak/>
+        <w:drawing>
+          <wp:inline distT="0" distB="0" distL="0" distR="0" wp14:anchorId="1881AEBF" wp14:editId="40822AF8">
+            <wp:extent cx="5612130" cy="2830830"/>
+            <wp:effectExtent l="0" t="0" r="7620" b="7620"/>
+            <wp:docPr id="1939199848" name="Imagen 1"/>
+            <wp:cNvGraphicFramePr>
+              <a:graphicFrameLocks xmlns:a="http://schemas.openxmlformats.org/drawingml/2006/main" noChangeAspect="1"/>
+            </wp:cNvGraphicFramePr>
+            <a:graphic xmlns:a="http://schemas.openxmlformats.org/drawingml/2006/main">
+              <a:graphicData uri="http://schemas.openxmlformats.org/drawingml/2006/picture">
+                <pic:pic xmlns:pic="http://schemas.openxmlformats.org/drawingml/2006/picture">
+                  <pic:nvPicPr>
+                    <pic:cNvPr id="1939199848" name=""/>
+                    <pic:cNvPicPr/>
+                  </pic:nvPicPr>
+                  <pic:blipFill>
+                    <a:blip r:embed="rId13"/>
+                    <a:stretch>
+                      <a:fillRect/>
+                    </a:stretch>
+                  </pic:blipFill>
+                  <pic:spPr>
+                    <a:xfrm>
+                      <a:off x="0" y="0"/>
+                      <a:ext cx="5612130" cy="2830830"/>
+                    </a:xfrm>
+                    <a:prstGeom prst="rect">
+                      <a:avLst/>
+                    </a:prstGeom>
+                  </pic:spPr>
+                </pic:pic>
+              </a:graphicData>
+            </a:graphic>
+          </wp:inline>
+        </w:drawing>
+      </w:r>
+      <w:r>
+        <w:rPr>
+          <w:rFonts w:ascii="Arial" w:hAnsi="Arial" w:cs="Arial"/>
+          <w:sz w:val="24"/>
+          <w:szCs w:val="24"/>
+        </w:rPr>
+        <w:br/>
+      </w:r>
+      <w:r>
+        <w:rPr>
+          <w:rFonts w:ascii="Arial" w:hAnsi="Arial" w:cs="Arial"/>
+          <w:sz w:val="24"/>
+          <w:szCs w:val="24"/>
+        </w:rPr>
+        <w:br/>
       </w:r>
     </w:p>
     <w:sectPr>

</xml_diff>